<commit_message>
Add reviewer demo admin access and update resume for live demo links.
Document read-only demo credentials in README, add SQL/script to provision the demo user on RDS, and refresh resume copy with categorized skills and production URLs.

Co-authored-by: Cursor <cursoragent@cursor.com>
</commit_message>
<xml_diff>
--- a/Yang_Zhang_Resume.docx
+++ b/Yang_Zhang_Resume.docx
@@ -52,7 +52,7 @@
           <w:b w:val="0"/>
           <w:sz w:val="18"/>
         </w:rPr>
-        <w:t>MSCS candidate (GPA 4.0) building production-style distributed systems. Shipped a 12-service e-commerce platform on AWS EKS with live HTTPS storefront, admin portal, and Stripe checkout; 9 backend unit tests and E2E checkout validation. Strong in Java/Spring, React/Next.js, PostgreSQL, and Kubernetes/Terraform. Background in neuroscience research and K-12 stakeholder collaboration. Bilingual: English and Mandarin.</w:t>
+        <w:t>MSCS candidate (GPA 4.0/4.0) specializing in enterprise-grade distributed systems and cloud CI/CD. Shipped a 12-service e-commerce platform on AWS EKS with a live HTTPS storefront, admin portal, and Stripe checkout. Proficient in Java/Spring Boot microservices, React/Next.js, PostgreSQL, and Kubernetes delivery (Terraform, Helm, GitHub Actions). Background in data-driven neuroscience research and cross-functional stakeholder collaboration. Bilingual: English and Mandarin.</w:t>
       </w:r>
     </w:p>
     <w:p>
@@ -81,7 +81,72 @@
           <w:b w:val="0"/>
           <w:sz w:val="18"/>
         </w:rPr>
-        <w:t>Java, Python, TypeScript, JavaScript, SQL, C  |  Spring Boot 3, Spring Cloud Gateway, Node.js, Express, Prisma  |  React, Next.js, Vue  |  PostgreSQL, Redis, Elasticsearch, MongoDB  |  AWS (EKS, ECR, ALB, S3, RDS), Terraform, Helm, Docker, K8s, Git, JUnit, Mockito, Playwright, Vitest  |  Microservices, RabbitMQ, JWT, OAuth2, Stripe</w:t>
+        <w:t>Languages: Java, Python, TypeScript, JavaScript, SQL, C</w:t>
+      </w:r>
+    </w:p>
+    <w:p>
+      <w:pPr>
+        <w:spacing w:after="20"/>
+      </w:pPr>
+      <w:r>
+        <w:rPr>
+          <w:rFonts w:ascii="Calibri" w:hAnsi="Calibri" w:eastAsia="Calibri"/>
+          <w:b w:val="0"/>
+          <w:sz w:val="18"/>
+        </w:rPr>
+        <w:t>Backend &amp; Microservices: Spring Boot 3, Spring Cloud Gateway, Consul, Node.js, Express, Prisma, RESTful APIs</w:t>
+      </w:r>
+    </w:p>
+    <w:p>
+      <w:pPr>
+        <w:spacing w:after="20"/>
+      </w:pPr>
+      <w:r>
+        <w:rPr>
+          <w:rFonts w:ascii="Calibri" w:hAnsi="Calibri" w:eastAsia="Calibri"/>
+          <w:b w:val="0"/>
+          <w:sz w:val="18"/>
+        </w:rPr>
+        <w:t>Frontend: React 19, Next.js, Vue, HTML5/CSS3</w:t>
+      </w:r>
+    </w:p>
+    <w:p>
+      <w:pPr>
+        <w:spacing w:after="20"/>
+      </w:pPr>
+      <w:r>
+        <w:rPr>
+          <w:rFonts w:ascii="Calibri" w:hAnsi="Calibri" w:eastAsia="Calibri"/>
+          <w:b w:val="0"/>
+          <w:sz w:val="18"/>
+        </w:rPr>
+        <w:t>Databases &amp; Caching: PostgreSQL, Redis (multi-level caching), Elasticsearch, MongoDB, Amazon RDS</w:t>
+      </w:r>
+    </w:p>
+    <w:p>
+      <w:pPr>
+        <w:spacing w:after="20"/>
+      </w:pPr>
+      <w:r>
+        <w:rPr>
+          <w:rFonts w:ascii="Calibri" w:hAnsi="Calibri" w:eastAsia="Calibri"/>
+          <w:b w:val="0"/>
+          <w:sz w:val="18"/>
+        </w:rPr>
+        <w:t>Cloud &amp; DevOps: AWS (EKS, ECR, ALB, S3, RDS), Terraform (IaC), Helm, Kubernetes, Docker, GitHub Actions, Linux</w:t>
+      </w:r>
+    </w:p>
+    <w:p>
+      <w:pPr>
+        <w:spacing w:after="0"/>
+      </w:pPr>
+      <w:r>
+        <w:rPr>
+          <w:rFonts w:ascii="Calibri" w:hAnsi="Calibri" w:eastAsia="Calibri"/>
+          <w:b w:val="0"/>
+          <w:sz w:val="18"/>
+        </w:rPr>
+        <w:t>Testing &amp; Tools: JUnit, Mockito, Playwright, Vitest, k6 (load testing), Git, Postman, Stripe API</w:t>
       </w:r>
     </w:p>
     <w:p>
@@ -110,7 +175,7 @@
           <w:b/>
           <w:sz w:val="18"/>
         </w:rPr>
-        <w:t>GrainMart — E-Commerce Platform (Microservices)</w:t>
+        <w:t>GrainMart — Distributed E-Commerce Platform (Microservices)</w:t>
       </w:r>
       <w:r>
         <w:rPr>
@@ -118,7 +183,7 @@
           <w:b w:val="0"/>
           <w:sz w:val="18"/>
         </w:rPr>
-        <w:t xml:space="preserve">  |  Full-Stack Developer  |  2024 – Present</w:t>
+        <w:t xml:space="preserve">  |  Lead Full-Stack Developer  |  2025 – Present</w:t>
       </w:r>
     </w:p>
     <w:p>
@@ -133,7 +198,7 @@
           <w:b w:val="0"/>
           <w:sz w:val="18"/>
         </w:rPr>
-        <w:t>Architected 12 Spring Boot microservices (database-per-service on AWS RDS PostgreSQL) with Consul discovery and Spring Cloud Gateway; offloaded product search to Elasticsearch; Redis cache-aside with penetration/breakdown/avalanche guards; idempotent orders and unique constraints on order numbers and Stripe webhook events.</w:t>
+        <w:t>Architected 12 Spring Boot microservices with database-per-service on AWS RDS PostgreSQL, Consul service discovery, and Spring Cloud Gateway routing.</w:t>
       </w:r>
     </w:p>
     <w:p>
@@ -148,7 +213,7 @@
           <w:b w:val="0"/>
           <w:sz w:val="18"/>
         </w:rPr>
-        <w:t>Delivered Next.js customer mall and Vue admin portal; Stripe Checkout, Google OAuth2, RabbitMQ async orders, and S3 presigned uploads.</w:t>
+        <w:t>Offloaded product search to Elasticsearch; built Redis cache-aside with guards against cache penetration, breakdown, and avalanche on read-heavy catalog paths.</w:t>
       </w:r>
     </w:p>
     <w:p>
@@ -163,7 +228,22 @@
           <w:b w:val="0"/>
           <w:sz w:val="18"/>
         </w:rPr>
-        <w:t>Deployed 12+ microservices on AWS EKS (Terraform, Helm, ALB + ACM HTTPS) across 3 public domains; GitHub Actions CD (unit tests → ECR → Helm atomic deploy); load-tested product search at ~36 RPS (k6, Gateway/Product HPA); 9 JUnit/Mockito unit tests plus 2 Playwright E2E suites and 10-step API purchase validation.</w:t>
+        <w:t>Delivered Next.js storefront and Vue admin console with Stripe Checkout, Google OAuth2, RabbitMQ async orders, and S3 presigned uploads; idempotent orders via unique constraints and Stripe webhook signature verification.</w:t>
+      </w:r>
+    </w:p>
+    <w:p>
+      <w:pPr>
+        <w:pStyle w:val="ListBullet"/>
+        <w:spacing w:after="0" w:line="240" w:lineRule="auto"/>
+        <w:ind w:left="144"/>
+      </w:pPr>
+      <w:r>
+        <w:rPr>
+          <w:rFonts w:ascii="Calibri" w:hAnsi="Calibri" w:eastAsia="Calibri"/>
+          <w:b w:val="0"/>
+          <w:sz w:val="18"/>
+        </w:rPr>
+        <w:t>Deployed on AWS EKS (Terraform, Helm, ALB + ACM HTTPS) across 3 domains; GitHub Actions CI/CD with OIDC (9 JUnit gate, SHA-tagged ECR images, Helm deploy, GitHub Secrets); Gateway/Product CPU HPA; k6 load test ~36 RPS on product search; 2 Playwright E2E suites and 10-step API purchase validation.</w:t>
       </w:r>
     </w:p>
     <w:p>
@@ -176,7 +256,7 @@
           <w:b w:val="0"/>
           <w:sz w:val="18"/>
         </w:rPr>
-        <w:t>Repository: github.com/Yang-Zhang1994/ecommerce-microservices-backend  |  Live: mall.yangzhangtech.online</w:t>
+        <w:t>Repository: github.com/Yang-Zhang1994/ecommerce-microservices-backend  |  Live: mall.yangzhangtech.online  |  Admin: admin.yangzhangtech.online (demo login in README)</w:t>
       </w:r>
     </w:p>
     <w:p>
@@ -212,7 +292,7 @@
           <w:b w:val="0"/>
           <w:sz w:val="18"/>
         </w:rPr>
-        <w:t>Built React 19 + Node/Express + Prisma/PostgreSQL app with ingredient-match search, role-based access, and seeded catalog (60+ ingredients, 30 recipes); 8 Vitest component tests.</w:t>
+        <w:t>Built React 19 + Node/Express + Prisma/PostgreSQL app with ingredient-matching search and role-based access; seeded catalog (60+ ingredients, 30 recipes); 8 Vitest component tests.</w:t>
       </w:r>
     </w:p>
     <w:p>
@@ -240,7 +320,7 @@
           <w:b/>
           <w:sz w:val="18"/>
         </w:rPr>
-        <w:t>BC PhysEd Educational Tool (EdTech)</w:t>
+        <w:t>BC PhysEd Educational Tool (EdTech Platform)</w:t>
       </w:r>
       <w:r>
         <w:rPr>
@@ -263,7 +343,22 @@
           <w:b w:val="0"/>
           <w:sz w:val="18"/>
         </w:rPr>
-        <w:t>Designed REST APIs and a teacher reporting portal for Grades 4–7 LMS; reward-scaling algorithm driven by real-time student performance (github.com/Yang-Zhang1994/bc-physed-digital-learning-tool).</w:t>
+        <w:t>Designed REST APIs and a teacher reporting portal for a Grades 4–7 LMS.</w:t>
+      </w:r>
+    </w:p>
+    <w:p>
+      <w:pPr>
+        <w:pStyle w:val="ListBullet"/>
+        <w:spacing w:after="0" w:line="240" w:lineRule="auto"/>
+        <w:ind w:left="144"/>
+      </w:pPr>
+      <w:r>
+        <w:rPr>
+          <w:rFonts w:ascii="Calibri" w:hAnsi="Calibri" w:eastAsia="Calibri"/>
+          <w:b w:val="0"/>
+          <w:sz w:val="18"/>
+        </w:rPr>
+        <w:t>Built a reward-scaling algorithm driven by real-time student performance analytics (github.com/Yang-Zhang1994/bc-physed-digital-learning-tool).</w:t>
       </w:r>
     </w:p>
     <w:p>
@@ -315,7 +410,7 @@
           <w:b w:val="0"/>
           <w:sz w:val="18"/>
         </w:rPr>
-        <w:t>Translated neuroscience research into software requirements with K-12 teachers; managed IRB protocols and coordinated national workshops — experience directly applied to user-centred API design in EdTech projects.</w:t>
+        <w:t>Translated neuroscience research into software requirements with K-12 educators; managed IRB protocols and coordinated national workshops to inform user-centred EdTech API design.</w:t>
       </w:r>
     </w:p>
     <w:p>
@@ -351,6 +446,32 @@
     </w:p>
     <w:p>
       <w:pPr>
+        <w:spacing w:after="20"/>
+      </w:pPr>
+      <w:r>
+        <w:rPr>
+          <w:rFonts w:ascii="Calibri" w:hAnsi="Calibri" w:eastAsia="Calibri"/>
+          <w:b w:val="0"/>
+          <w:sz w:val="18"/>
+        </w:rPr>
+        <w:t>Northeastern University — M.S. in Computer Science (GPA: 4.0/4.0)  |  2024 – Present</w:t>
+      </w:r>
+    </w:p>
+    <w:p>
+      <w:pPr>
+        <w:spacing w:after="20"/>
+      </w:pPr>
+      <w:r>
+        <w:rPr>
+          <w:rFonts w:ascii="Calibri" w:hAnsi="Calibri" w:eastAsia="Calibri"/>
+          <w:b w:val="0"/>
+          <w:sz w:val="18"/>
+        </w:rPr>
+        <w:t>East China Normal University — M.Ed. in Applied Psychology (GPA: 3.61/4.0)  |  2018 – 2021</w:t>
+      </w:r>
+    </w:p>
+    <w:p>
+      <w:pPr>
         <w:spacing w:after="0"/>
       </w:pPr>
       <w:r>
@@ -359,7 +480,7 @@
           <w:b w:val="0"/>
           <w:sz w:val="18"/>
         </w:rPr>
-        <w:t>Northeastern University — M.S. Computer Science (GPA: 4.0/4.0), 2024 – Present  |  East China Normal University — M.Ed. Applied Psychology (GPA: 3.61/4.0), 2018 – 2021  |  Central China Normal University — B.Sc. Chemistry, 2013 – 2017</w:t>
+        <w:t>Central China Normal University — B.Sc. in Chemistry  |  2013 – 2017</w:t>
       </w:r>
     </w:p>
     <w:sectPr>

</xml_diff>